<commit_message>
Industry filters and speed
</commit_message>
<xml_diff>
--- a/assets/quote_template.docx
+++ b/assets/quote_template.docx
@@ -841,7 +841,7 @@
                 <w:sz w:val="19"/>
                 <w:u w:val="none"/>
               </w:rPr>
-              <w:t>Set-up on site (kits) or on the institution's server (simulators), with acceptance testing.</w:t>
+              <w:t>Set-up on site (kits) or on the client's server (simulators), with acceptance testing.</w:t>
             </w:r>
           </w:p>
         </w:tc>
@@ -1342,7 +1342,7 @@
           <w:sz w:val="20"/>
           <w:u w:val="none"/>
         </w:rPr>
-        <w:t>Specifications may be adapted to the institution's needs, subject to technical feasibility.</w:t>
+        <w:t>Specifications may be adapted to the client's needs, subject to technical feasibility.</w:t>
       </w:r>
     </w:p>
     <w:p>

</xml_diff>